<commit_message>
Embed UI screenshots (Figures A.1 to A.10) into Appendix A User Manual in Appendices_A_to_D.docx
Co-authored-by: arena-agent <297053741+arena-agent@users.noreply.github.com>
</commit_message>
<xml_diff>
--- a/Appendices_A_to_D.docx
+++ b/Appendices_A_to_D.docx
@@ -1794,8 +1794,48 @@
     </w:p>
     <w:p>
       <w:pPr>
-        <w:spacing w:before="80" w:after="160" w:line="276" w:lineRule="auto"/>
-        <w:jc w:val="left"/>
+        <w:spacing w:before="120" w:after="40"/>
+        <w:jc w:val="center"/>
+      </w:pPr>
+      <w:r>
+        <w:drawing>
+          <wp:inline xmlns:a="http://schemas.openxmlformats.org/drawingml/2006/main" xmlns:pic="http://schemas.openxmlformats.org/drawingml/2006/picture">
+            <wp:extent cx="5669280" cy="3454718"/>
+            <wp:docPr id="1" name="Picture 1"/>
+            <wp:cNvGraphicFramePr>
+              <a:graphicFrameLocks noChangeAspect="1"/>
+            </wp:cNvGraphicFramePr>
+            <a:graphic>
+              <a:graphicData uri="http://schemas.openxmlformats.org/drawingml/2006/picture">
+                <pic:pic>
+                  <pic:nvPicPr>
+                    <pic:cNvPr id="0" name="fig_a1_landing.png"/>
+                    <pic:cNvPicPr/>
+                  </pic:nvPicPr>
+                  <pic:blipFill>
+                    <a:blip r:embed="rId10"/>
+                    <a:stretch>
+                      <a:fillRect/>
+                    </a:stretch>
+                  </pic:blipFill>
+                  <pic:spPr>
+                    <a:xfrm>
+                      <a:off x="0" y="0"/>
+                      <a:ext cx="5669280" cy="3454718"/>
+                    </a:xfrm>
+                    <a:prstGeom prst="rect"/>
+                  </pic:spPr>
+                </pic:pic>
+              </a:graphicData>
+            </a:graphic>
+          </wp:inline>
+        </w:drawing>
+      </w:r>
+    </w:p>
+    <w:p>
+      <w:pPr>
+        <w:spacing w:before="40" w:after="200" w:line="276" w:lineRule="auto"/>
+        <w:jc w:val="center"/>
       </w:pPr>
       <w:r>
         <w:rPr>
@@ -1805,7 +1845,7 @@
           <w:color w:val="555555"/>
           <w:sz w:val="17"/>
         </w:rPr>
-        <w:t>[Insert Figure A.1: Screenshot of the actual Public Landing Page and Attorney Directory search interface.]</w:t>
+        <w:t>Figure A.1. Public Landing Page and Attorney Directory Search Interface (index.html).</w:t>
       </w:r>
     </w:p>
     <w:p>
@@ -1957,8 +1997,48 @@
     </w:p>
     <w:p>
       <w:pPr>
-        <w:spacing w:before="80" w:after="160" w:line="276" w:lineRule="auto"/>
-        <w:jc w:val="left"/>
+        <w:spacing w:before="120" w:after="40"/>
+        <w:jc w:val="center"/>
+      </w:pPr>
+      <w:r>
+        <w:drawing>
+          <wp:inline xmlns:a="http://schemas.openxmlformats.org/drawingml/2006/main" xmlns:pic="http://schemas.openxmlformats.org/drawingml/2006/picture">
+            <wp:extent cx="5669280" cy="3188970"/>
+            <wp:docPr id="2" name="Picture 2"/>
+            <wp:cNvGraphicFramePr>
+              <a:graphicFrameLocks noChangeAspect="1"/>
+            </wp:cNvGraphicFramePr>
+            <a:graphic>
+              <a:graphicData uri="http://schemas.openxmlformats.org/drawingml/2006/picture">
+                <pic:pic>
+                  <pic:nvPicPr>
+                    <pic:cNvPr id="0" name="fig_a2_profile.png"/>
+                    <pic:cNvPicPr/>
+                  </pic:nvPicPr>
+                  <pic:blipFill>
+                    <a:blip r:embed="rId11"/>
+                    <a:stretch>
+                      <a:fillRect/>
+                    </a:stretch>
+                  </pic:blipFill>
+                  <pic:spPr>
+                    <a:xfrm>
+                      <a:off x="0" y="0"/>
+                      <a:ext cx="5669280" cy="3188970"/>
+                    </a:xfrm>
+                    <a:prstGeom prst="rect"/>
+                  </pic:spPr>
+                </pic:pic>
+              </a:graphicData>
+            </a:graphic>
+          </wp:inline>
+        </w:drawing>
+      </w:r>
+    </w:p>
+    <w:p>
+      <w:pPr>
+        <w:spacing w:before="40" w:after="200" w:line="276" w:lineRule="auto"/>
+        <w:jc w:val="center"/>
       </w:pPr>
       <w:r>
         <w:rPr>
@@ -1968,7 +2048,7 @@
           <w:color w:val="555555"/>
           <w:sz w:val="17"/>
         </w:rPr>
-        <w:t>[Insert Figure A.2: Screenshot of the actual Attorney Profile and Public Case History page.]</w:t>
+        <w:t>Figure A.2. Attorney Profile and Public Case History Page (attorney-profile.html).</w:t>
       </w:r>
     </w:p>
     <w:p>
@@ -2058,8 +2138,48 @@
     </w:p>
     <w:p>
       <w:pPr>
-        <w:spacing w:before="80" w:after="160" w:line="276" w:lineRule="auto"/>
-        <w:jc w:val="left"/>
+        <w:spacing w:before="120" w:after="40"/>
+        <w:jc w:val="center"/>
+      </w:pPr>
+      <w:r>
+        <w:drawing>
+          <wp:inline xmlns:a="http://schemas.openxmlformats.org/drawingml/2006/main" xmlns:pic="http://schemas.openxmlformats.org/drawingml/2006/picture">
+            <wp:extent cx="5669280" cy="3011805"/>
+            <wp:docPr id="3" name="Picture 3"/>
+            <wp:cNvGraphicFramePr>
+              <a:graphicFrameLocks noChangeAspect="1"/>
+            </wp:cNvGraphicFramePr>
+            <a:graphic>
+              <a:graphicData uri="http://schemas.openxmlformats.org/drawingml/2006/picture">
+                <pic:pic>
+                  <pic:nvPicPr>
+                    <pic:cNvPr id="0" name="fig_a3_public_cases.png"/>
+                    <pic:cNvPicPr/>
+                  </pic:nvPicPr>
+                  <pic:blipFill>
+                    <a:blip r:embed="rId12"/>
+                    <a:stretch>
+                      <a:fillRect/>
+                    </a:stretch>
+                  </pic:blipFill>
+                  <pic:spPr>
+                    <a:xfrm>
+                      <a:off x="0" y="0"/>
+                      <a:ext cx="5669280" cy="3011805"/>
+                    </a:xfrm>
+                    <a:prstGeom prst="rect"/>
+                  </pic:spPr>
+                </pic:pic>
+              </a:graphicData>
+            </a:graphic>
+          </wp:inline>
+        </w:drawing>
+      </w:r>
+    </w:p>
+    <w:p>
+      <w:pPr>
+        <w:spacing w:before="40" w:after="200" w:line="276" w:lineRule="auto"/>
+        <w:jc w:val="center"/>
       </w:pPr>
       <w:r>
         <w:rPr>
@@ -2069,7 +2189,7 @@
           <w:color w:val="555555"/>
           <w:sz w:val="17"/>
         </w:rPr>
-        <w:t>[Insert Figure A.3: Screenshot of the actual Public Case Lookup page.]</w:t>
+        <w:t>Figure A.3. Public Case Lookup Interface for Non-Confidential Records (public-cases.html).</w:t>
       </w:r>
     </w:p>
     <w:p>
@@ -2239,13 +2359,53 @@
           <w:color w:val="555555"/>
           <w:sz w:val="17"/>
         </w:rPr>
-        <w:t>Tip — Switching Between Light and Dark Mode: On any page of the system, click the theme button in the top-right navigation bar (☀️ Light / 🌙 Dark) to switch between light and dark display modes.</w:t>
+        <w:t>Tip — Switching Between Light and Dark Mode: On any page of the system, click the theme button in the top-right navigation bar (☀ Light / ☾ Dark) to switch between light and dark display modes.</w:t>
       </w:r>
     </w:p>
     <w:p>
       <w:pPr>
-        <w:spacing w:before="80" w:after="160" w:line="276" w:lineRule="auto"/>
-        <w:jc w:val="left"/>
+        <w:spacing w:before="120" w:after="40"/>
+        <w:jc w:val="center"/>
+      </w:pPr>
+      <w:r>
+        <w:drawing>
+          <wp:inline xmlns:a="http://schemas.openxmlformats.org/drawingml/2006/main" xmlns:pic="http://schemas.openxmlformats.org/drawingml/2006/picture">
+            <wp:extent cx="5669280" cy="3188970"/>
+            <wp:docPr id="4" name="Picture 4"/>
+            <wp:cNvGraphicFramePr>
+              <a:graphicFrameLocks noChangeAspect="1"/>
+            </wp:cNvGraphicFramePr>
+            <a:graphic>
+              <a:graphicData uri="http://schemas.openxmlformats.org/drawingml/2006/picture">
+                <pic:pic>
+                  <pic:nvPicPr>
+                    <pic:cNvPr id="0" name="fig_a4_login_modal.png"/>
+                    <pic:cNvPicPr/>
+                  </pic:nvPicPr>
+                  <pic:blipFill>
+                    <a:blip r:embed="rId13"/>
+                    <a:stretch>
+                      <a:fillRect/>
+                    </a:stretch>
+                  </pic:blipFill>
+                  <pic:spPr>
+                    <a:xfrm>
+                      <a:off x="0" y="0"/>
+                      <a:ext cx="5669280" cy="3188970"/>
+                    </a:xfrm>
+                    <a:prstGeom prst="rect"/>
+                  </pic:spPr>
+                </pic:pic>
+              </a:graphicData>
+            </a:graphic>
+          </wp:inline>
+        </w:drawing>
+      </w:r>
+    </w:p>
+    <w:p>
+      <w:pPr>
+        <w:spacing w:before="40" w:after="200" w:line="276" w:lineRule="auto"/>
+        <w:jc w:val="center"/>
       </w:pPr>
       <w:r>
         <w:rPr>
@@ -2255,7 +2415,7 @@
           <w:color w:val="555555"/>
           <w:sz w:val="17"/>
         </w:rPr>
-        <w:t>[Insert Figure A.4: Screenshot of the actual Staff Portal Sign In modal.]</w:t>
+        <w:t>Figure A.4. Staff Portal Sign In Authentication Modal.</w:t>
       </w:r>
     </w:p>
     <w:p>
@@ -2513,8 +2673,48 @@
     </w:p>
     <w:p>
       <w:pPr>
-        <w:spacing w:before="80" w:after="160" w:line="276" w:lineRule="auto"/>
-        <w:jc w:val="left"/>
+        <w:spacing w:before="120" w:after="40"/>
+        <w:jc w:val="center"/>
+      </w:pPr>
+      <w:r>
+        <w:drawing>
+          <wp:inline xmlns:a="http://schemas.openxmlformats.org/drawingml/2006/main" xmlns:pic="http://schemas.openxmlformats.org/drawingml/2006/picture">
+            <wp:extent cx="5669280" cy="3366135"/>
+            <wp:docPr id="5" name="Picture 5"/>
+            <wp:cNvGraphicFramePr>
+              <a:graphicFrameLocks noChangeAspect="1"/>
+            </wp:cNvGraphicFramePr>
+            <a:graphic>
+              <a:graphicData uri="http://schemas.openxmlformats.org/drawingml/2006/picture">
+                <pic:pic>
+                  <pic:nvPicPr>
+                    <pic:cNvPr id="0" name="fig_a5_dashboard.png"/>
+                    <pic:cNvPicPr/>
+                  </pic:nvPicPr>
+                  <pic:blipFill>
+                    <a:blip r:embed="rId14"/>
+                    <a:stretch>
+                      <a:fillRect/>
+                    </a:stretch>
+                  </pic:blipFill>
+                  <pic:spPr>
+                    <a:xfrm>
+                      <a:off x="0" y="0"/>
+                      <a:ext cx="5669280" cy="3366135"/>
+                    </a:xfrm>
+                    <a:prstGeom prst="rect"/>
+                  </pic:spPr>
+                </pic:pic>
+              </a:graphicData>
+            </a:graphic>
+          </wp:inline>
+        </w:drawing>
+      </w:r>
+    </w:p>
+    <w:p>
+      <w:pPr>
+        <w:spacing w:before="40" w:after="200" w:line="276" w:lineRule="auto"/>
+        <w:jc w:val="center"/>
       </w:pPr>
       <w:r>
         <w:rPr>
@@ -2524,7 +2724,7 @@
           <w:color w:val="555555"/>
           <w:sz w:val="17"/>
         </w:rPr>
-        <w:t>[Insert Figure A.5: Screenshot of the actual Attorney Workspace Dashboard and Managed Case Files table.]</w:t>
+        <w:t>Figure A.5. Attorney Workspace Dashboard, Quick Statistics, and Managed Case Files Table (dashboard.html).</w:t>
       </w:r>
     </w:p>
     <w:p>
@@ -3980,8 +4180,48 @@
     </w:p>
     <w:p>
       <w:pPr>
-        <w:spacing w:before="80" w:after="160" w:line="276" w:lineRule="auto"/>
-        <w:jc w:val="left"/>
+        <w:spacing w:before="120" w:after="40"/>
+        <w:jc w:val="center"/>
+      </w:pPr>
+      <w:r>
+        <w:drawing>
+          <wp:inline xmlns:a="http://schemas.openxmlformats.org/drawingml/2006/main" xmlns:pic="http://schemas.openxmlformats.org/drawingml/2006/picture">
+            <wp:extent cx="5669280" cy="3366135"/>
+            <wp:docPr id="6" name="Picture 6"/>
+            <wp:cNvGraphicFramePr>
+              <a:graphicFrameLocks noChangeAspect="1"/>
+            </wp:cNvGraphicFramePr>
+            <a:graphic>
+              <a:graphicData uri="http://schemas.openxmlformats.org/drawingml/2006/picture">
+                <pic:pic>
+                  <pic:nvPicPr>
+                    <pic:cNvPr id="0" name="fig_a6_create_case_drawer.png"/>
+                    <pic:cNvPicPr/>
+                  </pic:nvPicPr>
+                  <pic:blipFill>
+                    <a:blip r:embed="rId15"/>
+                    <a:stretch>
+                      <a:fillRect/>
+                    </a:stretch>
+                  </pic:blipFill>
+                  <pic:spPr>
+                    <a:xfrm>
+                      <a:off x="0" y="0"/>
+                      <a:ext cx="5669280" cy="3366135"/>
+                    </a:xfrm>
+                    <a:prstGeom prst="rect"/>
+                  </pic:spPr>
+                </pic:pic>
+              </a:graphicData>
+            </a:graphic>
+          </wp:inline>
+        </w:drawing>
+      </w:r>
+    </w:p>
+    <w:p>
+      <w:pPr>
+        <w:spacing w:before="40" w:after="200" w:line="276" w:lineRule="auto"/>
+        <w:jc w:val="center"/>
       </w:pPr>
       <w:r>
         <w:rPr>
@@ -3991,7 +4231,7 @@
           <w:color w:val="555555"/>
           <w:sz w:val="17"/>
         </w:rPr>
-        <w:t>[Insert Figure A.6: Screenshot of the actual Create New Legal Case slide-over drawer.]</w:t>
+        <w:t>Figure A.6. Create New Legal Case Slide-Over Drawer with Auto-Generated Case Number Preview.</w:t>
       </w:r>
     </w:p>
     <w:p>
@@ -4337,8 +4577,48 @@
     </w:p>
     <w:p>
       <w:pPr>
-        <w:spacing w:before="80" w:after="160" w:line="276" w:lineRule="auto"/>
-        <w:jc w:val="left"/>
+        <w:spacing w:before="120" w:after="40"/>
+        <w:jc w:val="center"/>
+      </w:pPr>
+      <w:r>
+        <w:drawing>
+          <wp:inline xmlns:a="http://schemas.openxmlformats.org/drawingml/2006/main" xmlns:pic="http://schemas.openxmlformats.org/drawingml/2006/picture">
+            <wp:extent cx="5669280" cy="3366135"/>
+            <wp:docPr id="7" name="Picture 7"/>
+            <wp:cNvGraphicFramePr>
+              <a:graphicFrameLocks noChangeAspect="1"/>
+            </wp:cNvGraphicFramePr>
+            <a:graphic>
+              <a:graphicData uri="http://schemas.openxmlformats.org/drawingml/2006/picture">
+                <pic:pic>
+                  <pic:nvPicPr>
+                    <pic:cNvPr id="0" name="fig_a7_documents_ocr.png"/>
+                    <pic:cNvPicPr/>
+                  </pic:nvPicPr>
+                  <pic:blipFill>
+                    <a:blip r:embed="rId16"/>
+                    <a:stretch>
+                      <a:fillRect/>
+                    </a:stretch>
+                  </pic:blipFill>
+                  <pic:spPr>
+                    <a:xfrm>
+                      <a:off x="0" y="0"/>
+                      <a:ext cx="5669280" cy="3366135"/>
+                    </a:xfrm>
+                    <a:prstGeom prst="rect"/>
+                  </pic:spPr>
+                </pic:pic>
+              </a:graphicData>
+            </a:graphic>
+          </wp:inline>
+        </w:drawing>
+      </w:r>
+    </w:p>
+    <w:p>
+      <w:pPr>
+        <w:spacing w:before="40" w:after="200" w:line="276" w:lineRule="auto"/>
+        <w:jc w:val="center"/>
       </w:pPr>
       <w:r>
         <w:rPr>
@@ -4348,7 +4628,7 @@
           <w:color w:val="555555"/>
           <w:sz w:val="17"/>
         </w:rPr>
-        <w:t>[Insert Figure A.7: Screenshot of the actual Case File Details page and Upload Case Document modal.]</w:t>
+        <w:t>Figure A.7. Case File Details, Document Archive with Extracted OCR Text, and Upload Document Modal (case-details.html).</w:t>
       </w:r>
     </w:p>
     <w:p>
@@ -4585,8 +4865,48 @@
     </w:p>
     <w:p>
       <w:pPr>
-        <w:spacing w:before="80" w:after="160" w:line="276" w:lineRule="auto"/>
-        <w:jc w:val="left"/>
+        <w:spacing w:before="120" w:after="40"/>
+        <w:jc w:val="center"/>
+      </w:pPr>
+      <w:r>
+        <w:drawing>
+          <wp:inline xmlns:a="http://schemas.openxmlformats.org/drawingml/2006/main" xmlns:pic="http://schemas.openxmlformats.org/drawingml/2006/picture">
+            <wp:extent cx="5669280" cy="3277552"/>
+            <wp:docPr id="8" name="Picture 8"/>
+            <wp:cNvGraphicFramePr>
+              <a:graphicFrameLocks noChangeAspect="1"/>
+            </wp:cNvGraphicFramePr>
+            <a:graphic>
+              <a:graphicData uri="http://schemas.openxmlformats.org/drawingml/2006/picture">
+                <pic:pic>
+                  <pic:nvPicPr>
+                    <pic:cNvPr id="0" name="fig_a8_clients.png"/>
+                    <pic:cNvPicPr/>
+                  </pic:nvPicPr>
+                  <pic:blipFill>
+                    <a:blip r:embed="rId17"/>
+                    <a:stretch>
+                      <a:fillRect/>
+                    </a:stretch>
+                  </pic:blipFill>
+                  <pic:spPr>
+                    <a:xfrm>
+                      <a:off x="0" y="0"/>
+                      <a:ext cx="5669280" cy="3277552"/>
+                    </a:xfrm>
+                    <a:prstGeom prst="rect"/>
+                  </pic:spPr>
+                </pic:pic>
+              </a:graphicData>
+            </a:graphic>
+          </wp:inline>
+        </w:drawing>
+      </w:r>
+    </w:p>
+    <w:p>
+      <w:pPr>
+        <w:spacing w:before="40" w:after="200" w:line="276" w:lineRule="auto"/>
+        <w:jc w:val="center"/>
       </w:pPr>
       <w:r>
         <w:rPr>
@@ -4596,7 +4916,7 @@
           <w:color w:val="555555"/>
           <w:sz w:val="17"/>
         </w:rPr>
-        <w:t>[Insert Figure A.8: Screenshot of the actual Client Profiles page and Linked Clients panel.]</w:t>
+        <w:t>Figure A.8. Client Profiles List and Create New Client Registration Form (clients.html).</w:t>
       </w:r>
     </w:p>
     <w:p>
@@ -4879,8 +5199,48 @@
     </w:p>
     <w:p>
       <w:pPr>
-        <w:spacing w:before="80" w:after="160" w:line="276" w:lineRule="auto"/>
-        <w:jc w:val="left"/>
+        <w:spacing w:before="120" w:after="40"/>
+        <w:jc w:val="center"/>
+      </w:pPr>
+      <w:r>
+        <w:drawing>
+          <wp:inline xmlns:a="http://schemas.openxmlformats.org/drawingml/2006/main" xmlns:pic="http://schemas.openxmlformats.org/drawingml/2006/picture">
+            <wp:extent cx="5669280" cy="3277552"/>
+            <wp:docPr id="9" name="Picture 9"/>
+            <wp:cNvGraphicFramePr>
+              <a:graphicFrameLocks noChangeAspect="1"/>
+            </wp:cNvGraphicFramePr>
+            <a:graphic>
+              <a:graphicData uri="http://schemas.openxmlformats.org/drawingml/2006/picture">
+                <pic:pic>
+                  <pic:nvPicPr>
+                    <pic:cNvPr id="0" name="fig_a9_counsel_hearings.png"/>
+                    <pic:cNvPicPr/>
+                  </pic:nvPicPr>
+                  <pic:blipFill>
+                    <a:blip r:embed="rId18"/>
+                    <a:stretch>
+                      <a:fillRect/>
+                    </a:stretch>
+                  </pic:blipFill>
+                  <pic:spPr>
+                    <a:xfrm>
+                      <a:off x="0" y="0"/>
+                      <a:ext cx="5669280" cy="3277552"/>
+                    </a:xfrm>
+                    <a:prstGeom prst="rect"/>
+                  </pic:spPr>
+                </pic:pic>
+              </a:graphicData>
+            </a:graphic>
+          </wp:inline>
+        </w:drawing>
+      </w:r>
+    </w:p>
+    <w:p>
+      <w:pPr>
+        <w:spacing w:before="40" w:after="200" w:line="276" w:lineRule="auto"/>
+        <w:jc w:val="center"/>
       </w:pPr>
       <w:r>
         <w:rPr>
@@ -4890,7 +5250,7 @@
           <w:color w:val="555555"/>
           <w:sz w:val="17"/>
         </w:rPr>
-        <w:t>[Insert Figure A.9: Screenshot of the actual Assigned Counsel and Scheduled Hearings sections.]</w:t>
+        <w:t>Figure A.9. Assigned Counsel, Linked Clients, and Scheduled Hearings with 1-Hour Conflict Guard.</w:t>
       </w:r>
     </w:p>
     <w:p>
@@ -5151,8 +5511,48 @@
     </w:p>
     <w:p>
       <w:pPr>
-        <w:spacing w:before="80" w:after="160" w:line="276" w:lineRule="auto"/>
-        <w:jc w:val="left"/>
+        <w:spacing w:before="120" w:after="40"/>
+        <w:jc w:val="center"/>
+      </w:pPr>
+      <w:r>
+        <w:drawing>
+          <wp:inline xmlns:a="http://schemas.openxmlformats.org/drawingml/2006/main" xmlns:pic="http://schemas.openxmlformats.org/drawingml/2006/picture">
+            <wp:extent cx="5669280" cy="3277552"/>
+            <wp:docPr id="10" name="Picture 10"/>
+            <wp:cNvGraphicFramePr>
+              <a:graphicFrameLocks noChangeAspect="1"/>
+            </wp:cNvGraphicFramePr>
+            <a:graphic>
+              <a:graphicData uri="http://schemas.openxmlformats.org/drawingml/2006/picture">
+                <pic:pic>
+                  <pic:nvPicPr>
+                    <pic:cNvPr id="0" name="fig_a10_admin.png"/>
+                    <pic:cNvPicPr/>
+                  </pic:nvPicPr>
+                  <pic:blipFill>
+                    <a:blip r:embed="rId19"/>
+                    <a:stretch>
+                      <a:fillRect/>
+                    </a:stretch>
+                  </pic:blipFill>
+                  <pic:spPr>
+                    <a:xfrm>
+                      <a:off x="0" y="0"/>
+                      <a:ext cx="5669280" cy="3277552"/>
+                    </a:xfrm>
+                    <a:prstGeom prst="rect"/>
+                  </pic:spPr>
+                </pic:pic>
+              </a:graphicData>
+            </a:graphic>
+          </wp:inline>
+        </w:drawing>
+      </w:r>
+    </w:p>
+    <w:p>
+      <w:pPr>
+        <w:spacing w:before="40" w:after="200" w:line="276" w:lineRule="auto"/>
+        <w:jc w:val="center"/>
       </w:pPr>
       <w:r>
         <w:rPr>
@@ -5162,7 +5562,7 @@
           <w:color w:val="555555"/>
           <w:sz w:val="17"/>
         </w:rPr>
-        <w:t>[Insert Figure A.10: Screenshot of the actual Administrator Attorney Management page.]</w:t>
+        <w:t>Figure A.10. Administrator Attorney Management and Directory Overview (admin.html).</w:t>
       </w:r>
     </w:p>
     <w:p>

</xml_diff>